<commit_message>
Update portfolio structure and fix project links
</commit_message>
<xml_diff>
--- a/cv/cv_en.docx
+++ b/cv/cv_en.docx
@@ -549,7 +549,7 @@
             <w:sz w:val="21"/>
             <w:szCs w:val="21"/>
           </w:rPr>
-          <w:t>https://github.com/Lync97/cyber_security_portfolio</w:t>
+          <w:t>https://github.com/Lync97/cybersecurity_portfolio</w:t>
         </w:r>
       </w:hyperlink>
     </w:p>
@@ -1187,8 +1187,6 @@
       </w:pPr>
       <w:r>
         <w:rPr>
-          <w:b/>
-          <w:bCs/>
           <w:sz w:val="21"/>
           <w:szCs w:val="21"/>
         </w:rPr>
@@ -4054,8 +4052,8 @@
       <w:u w:val="single"/>
     </w:rPr>
   </w:style>
-  <w:style w:type="character" w:styleId="Bulletsuser">
-    <w:name w:val="Bullets (user)"/>
+  <w:style w:type="character" w:styleId="Bullets">
+    <w:name w:val="Bullets"/>
     <w:qFormat/>
     <w:rPr>
       <w:rFonts w:ascii="OpenSymbol" w:hAnsi="OpenSymbol" w:eastAsia="OpenSymbol" w:cs="OpenSymbol"/>
@@ -4069,8 +4067,8 @@
       <w:iCs/>
     </w:rPr>
   </w:style>
-  <w:style w:type="character" w:styleId="Bullets">
-    <w:name w:val="Bullets"/>
+  <w:style w:type="character" w:styleId="Bulletsuser">
+    <w:name w:val="Bullets (user)"/>
     <w:qFormat/>
     <w:rPr>
       <w:rFonts w:ascii="OpenSymbol" w:hAnsi="OpenSymbol" w:eastAsia="OpenSymbol" w:cs="OpenSymbol"/>
@@ -4151,8 +4149,8 @@
       <w:szCs w:val="12"/>
     </w:rPr>
   </w:style>
-  <w:style w:type="paragraph" w:styleId="BlockQuotationuser">
-    <w:name w:val="Block Quotation (user)"/>
+  <w:style w:type="paragraph" w:styleId="BlockQuotation">
+    <w:name w:val="Block Quotation"/>
     <w:basedOn w:val="Normal"/>
     <w:qFormat/>
     <w:pPr>

</xml_diff>